<commit_message>
Fix num_pages whitespace bug
</commit_message>
<xml_diff>
--- a/BookVault_Technical_Report.docx
+++ b/BookVault_Technical_Report.docx
@@ -211,7 +211,13 @@
         <w:spacing w:after="160" w:line="276" w:lineRule="auto"/>
       </w:pPr>
       <w:r>
-        <w:t xml:space="preserve">The API follows a modular router-based architecture. Each resource (books, users, reviews, authors, analytics) has its own router file under app/routers/, keeping endpoint logic separated by domain. Shared concerns such as database configuration (database.py), authentication (auth.py), ORM models (models/models.py), and Pydantic schemas </w:t>
+        <w:t>The AP</w:t>
+      </w:r>
+      <w:r>
+        <w:t>\</w:t>
+      </w:r>
+      <w:r>
+        <w:t xml:space="preserve">I follows a modular router-based architecture. Each resource (books, users, reviews, authors, analytics) has its own router file under app/routers/, keeping endpoint logic separated by domain. Shared concerns such as database configuration (database.py), authentication (auth.py), ORM models (models/models.py), and Pydantic schemas </w:t>
       </w:r>
       <w:r>
         <w:lastRenderedPageBreak/>
@@ -620,10 +626,16 @@
         <w:t xml:space="preserve">Generative AI </w:t>
       </w:r>
       <w:r>
-        <w:t xml:space="preserve">(Claude AI Opus 4.6) </w:t>
-      </w:r>
-      <w:r>
-        <w:t xml:space="preserve">was used abundantly throughout this coursework from generating </w:t>
+        <w:t xml:space="preserve">(Claude) </w:t>
+      </w:r>
+      <w:r>
+        <w:t xml:space="preserve">was used </w:t>
+      </w:r>
+      <w:r>
+        <w:t xml:space="preserve">all </w:t>
+      </w:r>
+      <w:r>
+        <w:t xml:space="preserve">throughout this coursework from generating </w:t>
       </w:r>
       <w:r>
         <w:t>files such as main.py</w:t>
@@ -946,7 +958,6 @@
           <w:b/>
           <w:bCs/>
         </w:rPr>
-        <w:lastRenderedPageBreak/>
         <w:t>TestUsers</w:t>
       </w:r>
       <w:r>
@@ -965,6 +976,7 @@
           <w:b/>
           <w:bCs/>
         </w:rPr>
+        <w:lastRenderedPageBreak/>
         <w:t>TestReviews</w:t>
       </w:r>
       <w:r>
@@ -1197,10 +1209,7 @@
     </w:p>
     <w:p>
       <w:r>
-        <w:t>So,</w:t>
-      </w:r>
-      <w:r>
-        <w:t xml:space="preserve"> when someone POSTs a review with "review_text": "Great book!", Pydantic accepts it fine, but if you just did Review(**payload.model_dump()) directly, SQLAlchemy would receive a review_text key that doesn't match any column on the Review model — the column is called content. The review would be created but the text would be lost.</w:t>
+        <w:t>So, when someone POSTs a review with "review_text": "Great book!", Pydantic accepts it fine, but if you just did Review(**payload.model_dump()) directly, SQLAlchemy would receive a review_text key that doesn't match any column on the Review model — the column is called content. The review would be created but the text would be lost.</w:t>
       </w:r>
     </w:p>
     <w:p>
@@ -2597,6 +2606,7 @@
   <w:style w:type="character" w:default="1" w:styleId="DefaultParagraphFont">
     <w:name w:val="Default Paragraph Font"/>
     <w:uiPriority w:val="1"/>
+    <w:semiHidden/>
     <w:unhideWhenUsed/>
   </w:style>
   <w:style w:type="table" w:default="1" w:styleId="TableNormal">
@@ -2692,6 +2702,48 @@
       <w:color w:val="605E5C"/>
       <w:shd w:val="clear" w:color="auto" w:fill="E1DFDD"/>
     </w:rPr>
+  </w:style>
+  <w:style w:type="paragraph" w:styleId="Header">
+    <w:name w:val="header"/>
+    <w:basedOn w:val="Normal"/>
+    <w:link w:val="HeaderChar"/>
+    <w:uiPriority w:val="99"/>
+    <w:unhideWhenUsed/>
+    <w:rsid w:val="007910CF"/>
+    <w:pPr>
+      <w:tabs>
+        <w:tab w:val="center" w:pos="4513"/>
+        <w:tab w:val="right" w:pos="9026"/>
+      </w:tabs>
+    </w:pPr>
+  </w:style>
+  <w:style w:type="character" w:customStyle="1" w:styleId="HeaderChar">
+    <w:name w:val="Header Char"/>
+    <w:basedOn w:val="DefaultParagraphFont"/>
+    <w:link w:val="Header"/>
+    <w:uiPriority w:val="99"/>
+    <w:rsid w:val="007910CF"/>
+  </w:style>
+  <w:style w:type="paragraph" w:styleId="Footer">
+    <w:name w:val="footer"/>
+    <w:basedOn w:val="Normal"/>
+    <w:link w:val="FooterChar"/>
+    <w:uiPriority w:val="99"/>
+    <w:unhideWhenUsed/>
+    <w:rsid w:val="007910CF"/>
+    <w:pPr>
+      <w:tabs>
+        <w:tab w:val="center" w:pos="4513"/>
+        <w:tab w:val="right" w:pos="9026"/>
+      </w:tabs>
+    </w:pPr>
+  </w:style>
+  <w:style w:type="character" w:customStyle="1" w:styleId="FooterChar">
+    <w:name w:val="Footer Char"/>
+    <w:basedOn w:val="DefaultParagraphFont"/>
+    <w:link w:val="Footer"/>
+    <w:uiPriority w:val="99"/>
+    <w:rsid w:val="007910CF"/>
   </w:style>
 </w:styles>
 </file>

</xml_diff>